<commit_message>
3º commit (Ajustes finais: adição tela de início, tela de game over, tela de vitória, música na tela de início, música de game over e música de vitória. Alteração na velocidade dos meteoros)
</commit_message>
<xml_diff>
--- a/SpaceEscape/[AlgProg]_2025_II_Trabalho_G2_v1.docx
+++ b/SpaceEscape/[AlgProg]_2025_II_Trabalho_G2_v1.docx
@@ -2674,7 +2674,7 @@
               <w:rPr>
                 <w:b/>
                 <w:sz w:val="17"/>
-                <w:highlight w:val="magenta"/>
+                <w:highlight w:val="cyan"/>
               </w:rPr>
             </w:pPr>
             <w:r>
@@ -2683,7 +2683,7 @@
                 <w:spacing w:val="-2"/>
                 <w:w w:val="105"/>
                 <w:sz w:val="17"/>
-                <w:highlight w:val="magenta"/>
+                <w:highlight w:val="cyan"/>
               </w:rPr>
               <w:t>meteoros</w:t>
             </w:r>
@@ -2704,13 +2704,13 @@
               <w:jc w:val="left"/>
               <w:rPr>
                 <w:sz w:val="17"/>
-                <w:highlight w:val="magenta"/>
+                <w:highlight w:val="green"/>
               </w:rPr>
             </w:pPr>
             <w:r>
               <w:rPr>
                 <w:sz w:val="17"/>
-                <w:highlight w:val="magenta"/>
+                <w:highlight w:val="green"/>
               </w:rPr>
               <w:t>criar</w:t>
             </w:r>
@@ -2718,14 +2718,14 @@
               <w:rPr>
                 <w:spacing w:val="8"/>
                 <w:sz w:val="17"/>
-                <w:highlight w:val="magenta"/>
-              </w:rPr>
-              <w:t xml:space="preserve"> </w:t>
-            </w:r>
-            <w:r>
-              <w:rPr>
-                <w:sz w:val="17"/>
-                <w:highlight w:val="magenta"/>
+                <w:highlight w:val="green"/>
+              </w:rPr>
+              <w:t xml:space="preserve"> </w:t>
+            </w:r>
+            <w:r>
+              <w:rPr>
+                <w:sz w:val="17"/>
+                <w:highlight w:val="green"/>
               </w:rPr>
               <w:t>um</w:t>
             </w:r>
@@ -2733,14 +2733,14 @@
               <w:rPr>
                 <w:spacing w:val="12"/>
                 <w:sz w:val="17"/>
-                <w:highlight w:val="magenta"/>
-              </w:rPr>
-              <w:t xml:space="preserve"> </w:t>
-            </w:r>
-            <w:r>
-              <w:rPr>
-                <w:sz w:val="17"/>
-                <w:highlight w:val="magenta"/>
+                <w:highlight w:val="green"/>
+              </w:rPr>
+              <w:t xml:space="preserve"> </w:t>
+            </w:r>
+            <w:r>
+              <w:rPr>
+                <w:sz w:val="17"/>
+                <w:highlight w:val="green"/>
               </w:rPr>
               <w:t>tipo</w:t>
             </w:r>
@@ -2748,14 +2748,14 @@
               <w:rPr>
                 <w:spacing w:val="14"/>
                 <w:sz w:val="17"/>
-                <w:highlight w:val="magenta"/>
-              </w:rPr>
-              <w:t xml:space="preserve"> </w:t>
-            </w:r>
-            <w:r>
-              <w:rPr>
-                <w:sz w:val="17"/>
-                <w:highlight w:val="magenta"/>
+                <w:highlight w:val="green"/>
+              </w:rPr>
+              <w:t xml:space="preserve"> </w:t>
+            </w:r>
+            <w:r>
+              <w:rPr>
+                <w:sz w:val="17"/>
+                <w:highlight w:val="green"/>
               </w:rPr>
               <w:t>especial</w:t>
             </w:r>
@@ -2763,14 +2763,14 @@
               <w:rPr>
                 <w:spacing w:val="21"/>
                 <w:sz w:val="17"/>
-                <w:highlight w:val="magenta"/>
-              </w:rPr>
-              <w:t xml:space="preserve"> </w:t>
-            </w:r>
-            <w:r>
-              <w:rPr>
-                <w:sz w:val="17"/>
-                <w:highlight w:val="magenta"/>
+                <w:highlight w:val="green"/>
+              </w:rPr>
+              <w:t xml:space="preserve"> </w:t>
+            </w:r>
+            <w:r>
+              <w:rPr>
+                <w:sz w:val="17"/>
+                <w:highlight w:val="green"/>
               </w:rPr>
               <w:t>de</w:t>
             </w:r>
@@ -2778,14 +2778,14 @@
               <w:rPr>
                 <w:spacing w:val="22"/>
                 <w:sz w:val="17"/>
-                <w:highlight w:val="magenta"/>
-              </w:rPr>
-              <w:t xml:space="preserve"> </w:t>
-            </w:r>
-            <w:r>
-              <w:rPr>
-                <w:sz w:val="17"/>
-                <w:highlight w:val="magenta"/>
+                <w:highlight w:val="green"/>
+              </w:rPr>
+              <w:t xml:space="preserve"> </w:t>
+            </w:r>
+            <w:r>
+              <w:rPr>
+                <w:sz w:val="17"/>
+                <w:highlight w:val="green"/>
               </w:rPr>
               <w:t>meteoro</w:t>
             </w:r>
@@ -2793,14 +2793,14 @@
               <w:rPr>
                 <w:spacing w:val="14"/>
                 <w:sz w:val="17"/>
-                <w:highlight w:val="magenta"/>
-              </w:rPr>
-              <w:t xml:space="preserve"> </w:t>
-            </w:r>
-            <w:r>
-              <w:rPr>
-                <w:sz w:val="17"/>
-                <w:highlight w:val="magenta"/>
+                <w:highlight w:val="green"/>
+              </w:rPr>
+              <w:t xml:space="preserve"> </w:t>
+            </w:r>
+            <w:r>
+              <w:rPr>
+                <w:sz w:val="17"/>
+                <w:highlight w:val="green"/>
               </w:rPr>
               <w:t>que</w:t>
             </w:r>
@@ -2808,14 +2808,14 @@
               <w:rPr>
                 <w:spacing w:val="21"/>
                 <w:sz w:val="17"/>
-                <w:highlight w:val="magenta"/>
-              </w:rPr>
-              <w:t xml:space="preserve"> </w:t>
-            </w:r>
-            <w:r>
-              <w:rPr>
-                <w:sz w:val="17"/>
-                <w:highlight w:val="magenta"/>
+                <w:highlight w:val="green"/>
+              </w:rPr>
+              <w:t xml:space="preserve"> </w:t>
+            </w:r>
+            <w:r>
+              <w:rPr>
+                <w:sz w:val="17"/>
+                <w:highlight w:val="green"/>
               </w:rPr>
               <w:t>dá</w:t>
             </w:r>
@@ -2823,14 +2823,14 @@
               <w:rPr>
                 <w:spacing w:val="9"/>
                 <w:sz w:val="17"/>
-                <w:highlight w:val="magenta"/>
-              </w:rPr>
-              <w:t xml:space="preserve"> </w:t>
-            </w:r>
-            <w:r>
-              <w:rPr>
-                <w:sz w:val="17"/>
-                <w:highlight w:val="magenta"/>
+                <w:highlight w:val="green"/>
+              </w:rPr>
+              <w:t xml:space="preserve"> </w:t>
+            </w:r>
+            <w:r>
+              <w:rPr>
+                <w:sz w:val="17"/>
+                <w:highlight w:val="green"/>
               </w:rPr>
               <w:t>invulnerabilidade</w:t>
             </w:r>
@@ -2838,7 +2838,7 @@
               <w:rPr>
                 <w:spacing w:val="22"/>
                 <w:sz w:val="17"/>
-                <w:highlight w:val="magenta"/>
+                <w:highlight w:val="green"/>
               </w:rPr>
               <w:t xml:space="preserve"> </w:t>
             </w:r>
@@ -2846,7 +2846,7 @@
               <w:rPr>
                 <w:spacing w:val="-2"/>
                 <w:sz w:val="17"/>
-                <w:highlight w:val="magenta"/>
+                <w:highlight w:val="green"/>
               </w:rPr>
               <w:t>temporária</w:t>
             </w:r>
@@ -2858,13 +2858,13 @@
               <w:jc w:val="left"/>
               <w:rPr>
                 <w:sz w:val="17"/>
-                <w:highlight w:val="magenta"/>
+                <w:highlight w:val="green"/>
               </w:rPr>
             </w:pPr>
             <w:r>
               <w:rPr>
                 <w:sz w:val="17"/>
-                <w:highlight w:val="magenta"/>
+                <w:highlight w:val="green"/>
               </w:rPr>
               <w:t>para</w:t>
             </w:r>
@@ -2872,14 +2872,14 @@
               <w:rPr>
                 <w:spacing w:val="-4"/>
                 <w:sz w:val="17"/>
-                <w:highlight w:val="magenta"/>
-              </w:rPr>
-              <w:t xml:space="preserve"> </w:t>
-            </w:r>
-            <w:r>
-              <w:rPr>
-                <w:sz w:val="17"/>
-                <w:highlight w:val="magenta"/>
+                <w:highlight w:val="green"/>
+              </w:rPr>
+              <w:t xml:space="preserve"> </w:t>
+            </w:r>
+            <w:r>
+              <w:rPr>
+                <w:sz w:val="17"/>
+                <w:highlight w:val="green"/>
               </w:rPr>
               <w:t>a</w:t>
             </w:r>
@@ -2887,7 +2887,7 @@
               <w:rPr>
                 <w:spacing w:val="-3"/>
                 <w:sz w:val="17"/>
-                <w:highlight w:val="magenta"/>
+                <w:highlight w:val="green"/>
               </w:rPr>
               <w:t xml:space="preserve"> </w:t>
             </w:r>
@@ -2895,7 +2895,7 @@
               <w:rPr>
                 <w:spacing w:val="-4"/>
                 <w:sz w:val="17"/>
-                <w:highlight w:val="magenta"/>
+                <w:highlight w:val="green"/>
               </w:rPr>
               <w:t>nave</w:t>
             </w:r>
@@ -2948,7 +2948,7 @@
               <w:rPr>
                 <w:b/>
                 <w:sz w:val="17"/>
-                <w:highlight w:val="magenta"/>
+                <w:highlight w:val="cyan"/>
               </w:rPr>
             </w:pPr>
             <w:r>
@@ -2957,7 +2957,7 @@
                 <w:spacing w:val="-2"/>
                 <w:w w:val="105"/>
                 <w:sz w:val="17"/>
-                <w:highlight w:val="magenta"/>
+                <w:highlight w:val="cyan"/>
               </w:rPr>
               <w:t>meteoros</w:t>
             </w:r>
@@ -2977,13 +2977,13 @@
               <w:jc w:val="left"/>
               <w:rPr>
                 <w:sz w:val="17"/>
-                <w:highlight w:val="magenta"/>
+                <w:highlight w:val="cyan"/>
               </w:rPr>
             </w:pPr>
             <w:r>
               <w:rPr>
                 <w:sz w:val="17"/>
-                <w:highlight w:val="magenta"/>
+                <w:highlight w:val="cyan"/>
               </w:rPr>
               <w:t>criar</w:t>
             </w:r>
@@ -2991,14 +2991,14 @@
               <w:rPr>
                 <w:spacing w:val="4"/>
                 <w:sz w:val="17"/>
-                <w:highlight w:val="magenta"/>
-              </w:rPr>
-              <w:t xml:space="preserve"> </w:t>
-            </w:r>
-            <w:r>
-              <w:rPr>
-                <w:sz w:val="17"/>
-                <w:highlight w:val="magenta"/>
+                <w:highlight w:val="cyan"/>
+              </w:rPr>
+              <w:t xml:space="preserve"> </w:t>
+            </w:r>
+            <w:r>
+              <w:rPr>
+                <w:sz w:val="17"/>
+                <w:highlight w:val="cyan"/>
               </w:rPr>
               <w:t>um</w:t>
             </w:r>
@@ -3006,14 +3006,14 @@
               <w:rPr>
                 <w:spacing w:val="9"/>
                 <w:sz w:val="17"/>
-                <w:highlight w:val="magenta"/>
-              </w:rPr>
-              <w:t xml:space="preserve"> </w:t>
-            </w:r>
-            <w:r>
-              <w:rPr>
-                <w:sz w:val="17"/>
-                <w:highlight w:val="magenta"/>
+                <w:highlight w:val="cyan"/>
+              </w:rPr>
+              <w:t xml:space="preserve"> </w:t>
+            </w:r>
+            <w:r>
+              <w:rPr>
+                <w:sz w:val="17"/>
+                <w:highlight w:val="cyan"/>
               </w:rPr>
               <w:t>tipo</w:t>
             </w:r>
@@ -3021,14 +3021,14 @@
               <w:rPr>
                 <w:spacing w:val="10"/>
                 <w:sz w:val="17"/>
-                <w:highlight w:val="magenta"/>
-              </w:rPr>
-              <w:t xml:space="preserve"> </w:t>
-            </w:r>
-            <w:r>
-              <w:rPr>
-                <w:sz w:val="17"/>
-                <w:highlight w:val="magenta"/>
+                <w:highlight w:val="cyan"/>
+              </w:rPr>
+              <w:t xml:space="preserve"> </w:t>
+            </w:r>
+            <w:r>
+              <w:rPr>
+                <w:sz w:val="17"/>
+                <w:highlight w:val="cyan"/>
               </w:rPr>
               <w:t>especial</w:t>
             </w:r>
@@ -3036,14 +3036,14 @@
               <w:rPr>
                 <w:spacing w:val="17"/>
                 <w:sz w:val="17"/>
-                <w:highlight w:val="magenta"/>
-              </w:rPr>
-              <w:t xml:space="preserve"> </w:t>
-            </w:r>
-            <w:r>
-              <w:rPr>
-                <w:sz w:val="17"/>
-                <w:highlight w:val="magenta"/>
+                <w:highlight w:val="cyan"/>
+              </w:rPr>
+              <w:t xml:space="preserve"> </w:t>
+            </w:r>
+            <w:r>
+              <w:rPr>
+                <w:sz w:val="17"/>
+                <w:highlight w:val="cyan"/>
               </w:rPr>
               <w:t>de</w:t>
             </w:r>
@@ -3051,14 +3051,14 @@
               <w:rPr>
                 <w:spacing w:val="17"/>
                 <w:sz w:val="17"/>
-                <w:highlight w:val="magenta"/>
-              </w:rPr>
-              <w:t xml:space="preserve"> </w:t>
-            </w:r>
-            <w:r>
-              <w:rPr>
-                <w:sz w:val="17"/>
-                <w:highlight w:val="magenta"/>
+                <w:highlight w:val="cyan"/>
+              </w:rPr>
+              <w:t xml:space="preserve"> </w:t>
+            </w:r>
+            <w:r>
+              <w:rPr>
+                <w:sz w:val="17"/>
+                <w:highlight w:val="cyan"/>
               </w:rPr>
               <w:t>meteoro</w:t>
             </w:r>
@@ -3066,14 +3066,14 @@
               <w:rPr>
                 <w:spacing w:val="10"/>
                 <w:sz w:val="17"/>
-                <w:highlight w:val="magenta"/>
-              </w:rPr>
-              <w:t xml:space="preserve"> </w:t>
-            </w:r>
-            <w:r>
-              <w:rPr>
-                <w:sz w:val="17"/>
-                <w:highlight w:val="magenta"/>
+                <w:highlight w:val="cyan"/>
+              </w:rPr>
+              <w:t xml:space="preserve"> </w:t>
+            </w:r>
+            <w:r>
+              <w:rPr>
+                <w:sz w:val="17"/>
+                <w:highlight w:val="cyan"/>
               </w:rPr>
               <w:t>que</w:t>
             </w:r>
@@ -3081,14 +3081,14 @@
               <w:rPr>
                 <w:spacing w:val="16"/>
                 <w:sz w:val="17"/>
-                <w:highlight w:val="magenta"/>
-              </w:rPr>
-              <w:t xml:space="preserve"> </w:t>
-            </w:r>
-            <w:r>
-              <w:rPr>
-                <w:sz w:val="17"/>
-                <w:highlight w:val="magenta"/>
+                <w:highlight w:val="cyan"/>
+              </w:rPr>
+              <w:t xml:space="preserve"> </w:t>
+            </w:r>
+            <w:r>
+              <w:rPr>
+                <w:sz w:val="17"/>
+                <w:highlight w:val="cyan"/>
               </w:rPr>
               <w:t>adiciona</w:t>
             </w:r>
@@ -3096,14 +3096,14 @@
               <w:rPr>
                 <w:spacing w:val="6"/>
                 <w:sz w:val="17"/>
-                <w:highlight w:val="magenta"/>
-              </w:rPr>
-              <w:t xml:space="preserve"> </w:t>
-            </w:r>
-            <w:r>
-              <w:rPr>
-                <w:sz w:val="17"/>
-                <w:highlight w:val="magenta"/>
+                <w:highlight w:val="cyan"/>
+              </w:rPr>
+              <w:t xml:space="preserve"> </w:t>
+            </w:r>
+            <w:r>
+              <w:rPr>
+                <w:sz w:val="17"/>
+                <w:highlight w:val="cyan"/>
               </w:rPr>
               <w:t>capacidades</w:t>
             </w:r>
@@ -3111,14 +3111,14 @@
               <w:rPr>
                 <w:spacing w:val="10"/>
                 <w:sz w:val="17"/>
-                <w:highlight w:val="magenta"/>
-              </w:rPr>
-              <w:t xml:space="preserve"> </w:t>
-            </w:r>
-            <w:r>
-              <w:rPr>
-                <w:sz w:val="17"/>
-                <w:highlight w:val="magenta"/>
+                <w:highlight w:val="cyan"/>
+              </w:rPr>
+              <w:t xml:space="preserve"> </w:t>
+            </w:r>
+            <w:r>
+              <w:rPr>
+                <w:sz w:val="17"/>
+                <w:highlight w:val="cyan"/>
               </w:rPr>
               <w:t>a</w:t>
             </w:r>
@@ -3126,14 +3126,14 @@
               <w:rPr>
                 <w:spacing w:val="6"/>
                 <w:sz w:val="17"/>
-                <w:highlight w:val="magenta"/>
-              </w:rPr>
-              <w:t xml:space="preserve"> </w:t>
-            </w:r>
-            <w:r>
-              <w:rPr>
-                <w:sz w:val="17"/>
-                <w:highlight w:val="magenta"/>
+                <w:highlight w:val="cyan"/>
+              </w:rPr>
+              <w:t xml:space="preserve"> </w:t>
+            </w:r>
+            <w:r>
+              <w:rPr>
+                <w:sz w:val="17"/>
+                <w:highlight w:val="cyan"/>
               </w:rPr>
               <w:t>nave,</w:t>
             </w:r>
@@ -3141,7 +3141,7 @@
               <w:rPr>
                 <w:spacing w:val="13"/>
                 <w:sz w:val="17"/>
-                <w:highlight w:val="magenta"/>
+                <w:highlight w:val="cyan"/>
               </w:rPr>
               <w:t xml:space="preserve"> </w:t>
             </w:r>
@@ -3149,7 +3149,7 @@
               <w:rPr>
                 <w:spacing w:val="-4"/>
                 <w:sz w:val="17"/>
-                <w:highlight w:val="magenta"/>
+                <w:highlight w:val="cyan"/>
               </w:rPr>
               <w:t>como</w:t>
             </w:r>
@@ -3161,13 +3161,13 @@
               <w:jc w:val="left"/>
               <w:rPr>
                 <w:sz w:val="17"/>
-                <w:highlight w:val="magenta"/>
+                <w:highlight w:val="cyan"/>
               </w:rPr>
             </w:pPr>
             <w:r>
               <w:rPr>
                 <w:sz w:val="17"/>
-                <w:highlight w:val="magenta"/>
+                <w:highlight w:val="cyan"/>
               </w:rPr>
               <w:t>escudos</w:t>
             </w:r>
@@ -3175,14 +3175,14 @@
               <w:rPr>
                 <w:spacing w:val="5"/>
                 <w:sz w:val="17"/>
-                <w:highlight w:val="magenta"/>
-              </w:rPr>
-              <w:t xml:space="preserve"> </w:t>
-            </w:r>
-            <w:r>
-              <w:rPr>
-                <w:sz w:val="17"/>
-                <w:highlight w:val="magenta"/>
+                <w:highlight w:val="cyan"/>
+              </w:rPr>
+              <w:t xml:space="preserve"> </w:t>
+            </w:r>
+            <w:r>
+              <w:rPr>
+                <w:sz w:val="17"/>
+                <w:highlight w:val="cyan"/>
               </w:rPr>
               <w:t>ou</w:t>
             </w:r>
@@ -3190,14 +3190,14 @@
               <w:rPr>
                 <w:spacing w:val="6"/>
                 <w:sz w:val="17"/>
-                <w:highlight w:val="magenta"/>
-              </w:rPr>
-              <w:t xml:space="preserve"> </w:t>
-            </w:r>
-            <w:r>
-              <w:rPr>
-                <w:sz w:val="17"/>
-                <w:highlight w:val="magenta"/>
+                <w:highlight w:val="cyan"/>
+              </w:rPr>
+              <w:t xml:space="preserve"> </w:t>
+            </w:r>
+            <w:r>
+              <w:rPr>
+                <w:sz w:val="17"/>
+                <w:highlight w:val="cyan"/>
               </w:rPr>
               <w:t>armas</w:t>
             </w:r>
@@ -3205,7 +3205,7 @@
               <w:rPr>
                 <w:spacing w:val="6"/>
                 <w:sz w:val="17"/>
-                <w:highlight w:val="magenta"/>
+                <w:highlight w:val="cyan"/>
               </w:rPr>
               <w:t xml:space="preserve"> </w:t>
             </w:r>
@@ -3213,7 +3213,7 @@
               <w:rPr>
                 <w:spacing w:val="-2"/>
                 <w:sz w:val="17"/>
-                <w:highlight w:val="magenta"/>
+                <w:highlight w:val="cyan"/>
               </w:rPr>
               <w:t>adicionais</w:t>
             </w:r>

</xml_diff>